<commit_message>
Added documents for the first 3 points of the week 2 deliverable
</commit_message>
<xml_diff>
--- a/docs/Documento de Visión y Alcance.docx
+++ b/docs/Documento de Visión y Alcance.docx
@@ -154,8 +154,21 @@
           <w:szCs w:val="22"/>
           <w:lang w:val="es-CR"/>
         </w:rPr>
-        <w:t>Natalia Ortiz Martinez</w:t>
-      </w:r>
+        <w:t xml:space="preserve">Natalia Ortiz </w:t>
+      </w:r>
+      <w:proofErr w:type="spellStart"/>
+      <w:r>
+        <w:rPr>
+          <w:rFonts w:ascii="Times New Roman" w:hAnsi="Times New Roman"/>
+          <w:b w:val="0"/>
+          <w:bCs/>
+          <w:sz w:val="32"/>
+          <w:szCs w:val="22"/>
+          <w:lang w:val="es-CR"/>
+        </w:rPr>
+        <w:t>Martinez</w:t>
+      </w:r>
+      <w:proofErr w:type="spellEnd"/>
     </w:p>
     <w:p>
       <w:pPr>
@@ -1962,12 +1975,28 @@
                 <w:lang w:val="es-CR"/>
               </w:rPr>
             </w:pPr>
+            <w:proofErr w:type="spellStart"/>
             <w:r>
               <w:rPr>
                 <w:lang w:val="es-CR"/>
               </w:rPr>
-              <w:t>Team Developer</w:t>
-            </w:r>
+              <w:t>Team</w:t>
+            </w:r>
+            <w:proofErr w:type="spellEnd"/>
+            <w:r>
+              <w:rPr>
+                <w:lang w:val="es-CR"/>
+              </w:rPr>
+              <w:t xml:space="preserve"> </w:t>
+            </w:r>
+            <w:proofErr w:type="spellStart"/>
+            <w:r>
+              <w:rPr>
+                <w:lang w:val="es-CR"/>
+              </w:rPr>
+              <w:t>Developer</w:t>
+            </w:r>
+            <w:proofErr w:type="spellEnd"/>
           </w:p>
         </w:tc>
         <w:tc>
@@ -2067,12 +2096,28 @@
                 <w:lang w:val="es-CR"/>
               </w:rPr>
             </w:pPr>
+            <w:proofErr w:type="spellStart"/>
             <w:r>
               <w:rPr>
                 <w:lang w:val="es-CR"/>
               </w:rPr>
-              <w:t>Team Developer</w:t>
-            </w:r>
+              <w:t>Team</w:t>
+            </w:r>
+            <w:proofErr w:type="spellEnd"/>
+            <w:r>
+              <w:rPr>
+                <w:lang w:val="es-CR"/>
+              </w:rPr>
+              <w:t xml:space="preserve"> </w:t>
+            </w:r>
+            <w:proofErr w:type="spellStart"/>
+            <w:r>
+              <w:rPr>
+                <w:lang w:val="es-CR"/>
+              </w:rPr>
+              <w:t>Developer</w:t>
+            </w:r>
+            <w:proofErr w:type="spellEnd"/>
           </w:p>
         </w:tc>
         <w:tc>
@@ -2151,12 +2196,28 @@
                 <w:lang w:val="es-CR"/>
               </w:rPr>
             </w:pPr>
+            <w:proofErr w:type="spellStart"/>
             <w:r>
               <w:rPr>
                 <w:lang w:val="es-CR"/>
               </w:rPr>
-              <w:t>Team Developer</w:t>
-            </w:r>
+              <w:t>Team</w:t>
+            </w:r>
+            <w:proofErr w:type="spellEnd"/>
+            <w:r>
+              <w:rPr>
+                <w:lang w:val="es-CR"/>
+              </w:rPr>
+              <w:t xml:space="preserve"> </w:t>
+            </w:r>
+            <w:proofErr w:type="spellStart"/>
+            <w:r>
+              <w:rPr>
+                <w:lang w:val="es-CR"/>
+              </w:rPr>
+              <w:t>Developer</w:t>
+            </w:r>
+            <w:proofErr w:type="spellEnd"/>
           </w:p>
         </w:tc>
         <w:tc>
@@ -2247,12 +2308,28 @@
                 <w:lang w:val="es-CR"/>
               </w:rPr>
             </w:pPr>
+            <w:proofErr w:type="spellStart"/>
             <w:r>
               <w:rPr>
                 <w:lang w:val="es-CR"/>
               </w:rPr>
-              <w:t>Team Developer</w:t>
-            </w:r>
+              <w:t>Team</w:t>
+            </w:r>
+            <w:proofErr w:type="spellEnd"/>
+            <w:r>
+              <w:rPr>
+                <w:lang w:val="es-CR"/>
+              </w:rPr>
+              <w:t xml:space="preserve"> </w:t>
+            </w:r>
+            <w:proofErr w:type="spellStart"/>
+            <w:r>
+              <w:rPr>
+                <w:lang w:val="es-CR"/>
+              </w:rPr>
+              <w:t>Developer</w:t>
+            </w:r>
+            <w:proofErr w:type="spellEnd"/>
           </w:p>
         </w:tc>
         <w:tc>
@@ -2331,12 +2408,28 @@
                 <w:lang w:val="es-CR"/>
               </w:rPr>
             </w:pPr>
+            <w:proofErr w:type="spellStart"/>
             <w:r>
               <w:rPr>
                 <w:lang w:val="es-CR"/>
               </w:rPr>
-              <w:t>Team Developer</w:t>
-            </w:r>
+              <w:t>Team</w:t>
+            </w:r>
+            <w:proofErr w:type="spellEnd"/>
+            <w:r>
+              <w:rPr>
+                <w:lang w:val="es-CR"/>
+              </w:rPr>
+              <w:t xml:space="preserve"> </w:t>
+            </w:r>
+            <w:proofErr w:type="spellStart"/>
+            <w:r>
+              <w:rPr>
+                <w:lang w:val="es-CR"/>
+              </w:rPr>
+              <w:t>Developer</w:t>
+            </w:r>
+            <w:proofErr w:type="spellEnd"/>
           </w:p>
         </w:tc>
         <w:tc>
@@ -2675,7 +2768,49 @@
         <w:rPr>
           <w:lang w:val="es-CR" w:eastAsia="es-CR"/>
         </w:rPr>
-        <w:t>La solución permitirá eliminar errores comunes en el registro de ingresos y egresos, facilitar el cierre de caja diario, controlar de manera eficiente los platillos, precios e inventarios de ingredientes, y mejorar la experiencia del cliente mediante una gestión organizada de reservas. Asimismo, digitalizará el historial de ventas, permitiendo la generación de facturas detalladas con desglose de impuestos, y automatizará el cálculo de salarios en función de las horas trabajadas, minimizando riesgos de conflictos laborales.</w:t>
+        <w:t>La solución permitirá eliminar errores comunes en el registro de ingresos y egresos, facilitar el cierre de caja diario, controlar de manera eficiente los platillos, precios</w:t>
+      </w:r>
+      <w:r>
+        <w:rPr>
+          <w:lang w:val="es-CR" w:eastAsia="es-CR"/>
+        </w:rPr>
+        <w:t>,</w:t>
+      </w:r>
+      <w:r>
+        <w:rPr>
+          <w:lang w:val="es-CR" w:eastAsia="es-CR"/>
+        </w:rPr>
+        <w:t xml:space="preserve"> inventario de</w:t>
+      </w:r>
+      <w:r>
+        <w:rPr>
+          <w:lang w:val="es-CR" w:eastAsia="es-CR"/>
+        </w:rPr>
+        <w:t xml:space="preserve"> pro</w:t>
+      </w:r>
+      <w:r>
+        <w:rPr>
+          <w:lang w:val="es-CR" w:eastAsia="es-CR"/>
+        </w:rPr>
+        <w:t>ductos</w:t>
+      </w:r>
+      <w:r>
+        <w:rPr>
+          <w:lang w:val="es-CR" w:eastAsia="es-CR"/>
+        </w:rPr>
+        <w:t>, y mejorar la experiencia del</w:t>
+      </w:r>
+      <w:r>
+        <w:rPr>
+          <w:lang w:val="es-CR" w:eastAsia="es-CR"/>
+        </w:rPr>
+        <w:t xml:space="preserve"> usuario</w:t>
+      </w:r>
+      <w:r>
+        <w:rPr>
+          <w:lang w:val="es-CR" w:eastAsia="es-CR"/>
+        </w:rPr>
+        <w:t xml:space="preserve"> mediante una gestión organizada de reservas. Asimismo, digitalizará el historial de ventas, permitiendo la generación de facturas detallada, y automatizará el cálculo de salarios en función de las horas trabajadas, minimizando riesgos de conflictos laborales.</w:t>
       </w:r>
     </w:p>
     <w:p>
@@ -2735,26 +2870,6 @@
     </w:p>
     <w:p>
       <w:pPr>
-        <w:pStyle w:val="Prrafodelista"/>
-        <w:numPr>
-          <w:ilvl w:val="0"/>
-          <w:numId w:val="45"/>
-        </w:numPr>
-        <w:spacing w:line="360" w:lineRule="auto"/>
-        <w:jc w:val="both"/>
-        <w:rPr>
-          <w:lang w:val="es-CR" w:eastAsia="es-CR"/>
-        </w:rPr>
-      </w:pPr>
-      <w:r>
-        <w:rPr>
-          <w:lang w:val="es-CR" w:eastAsia="es-CR"/>
-        </w:rPr>
-        <w:t>Los clientes experimentarán un servicio más organizado y profesional, en un ambiente laboral positivo.</w:t>
-      </w:r>
-    </w:p>
-    <w:p>
-      <w:pPr>
         <w:spacing w:line="360" w:lineRule="auto"/>
         <w:jc w:val="both"/>
         <w:rPr>
@@ -3042,7 +3157,6 @@
           <w:szCs w:val="22"/>
           <w:lang w:val="es-CR"/>
         </w:rPr>
-        <w:lastRenderedPageBreak/>
         <w:t>Gestión de Personal:</w:t>
       </w:r>
       <w:r>
@@ -3100,6 +3214,7 @@
           <w:szCs w:val="22"/>
           <w:lang w:val="es-CR"/>
         </w:rPr>
+        <w:lastRenderedPageBreak/>
         <w:t>El sistema no contemplará las siguientes funcionalidades:</w:t>
       </w:r>
     </w:p>
@@ -3441,19 +3556,7 @@
           <w:szCs w:val="22"/>
           <w:lang w:val="es-US"/>
         </w:rPr>
-        <w:t xml:space="preserve">El uso de métodos manuales y herramientas básicas (como papel o hojas de cálculo) para registrar ingresos, egresos, inventario, ventas, asistencia y reservas, afecta negativamente la productividad del restaurante. Las tareas administrativas consumen más tiempo del necesario, no </w:t>
-      </w:r>
-      <w:r>
-        <w:rPr>
-          <w:rFonts w:ascii="Times New Roman" w:hAnsi="Times New Roman"/>
-          <w:i w:val="0"/>
-          <w:iCs/>
-          <w:sz w:val="24"/>
-          <w:szCs w:val="22"/>
-          <w:lang w:val="es-US"/>
-        </w:rPr>
-        <w:lastRenderedPageBreak/>
-        <w:t>se dispone de reportes precisos y actualizados, y existe una alta probabilidad de errores y pérdida de información.</w:t>
+        <w:t>El uso de métodos manuales y herramientas básicas (como papel o hojas de cálculo) para registrar ingresos, egresos, inventario, ventas, asistencia y reservas, afecta negativamente la productividad del restaurante. Las tareas administrativas consumen más tiempo del necesario, no se dispone de reportes precisos y actualizados, y existe una alta probabilidad de errores y pérdida de información.</w:t>
       </w:r>
       <w:r>
         <w:rPr>
@@ -3492,6 +3595,7 @@
           <w:szCs w:val="22"/>
           <w:lang w:val="es-US"/>
         </w:rPr>
+        <w:lastRenderedPageBreak/>
         <w:t>Implicación:</w:t>
       </w:r>
       <w:r>
@@ -3695,7 +3799,7 @@
           <w:szCs w:val="22"/>
           <w:lang w:val="es-US"/>
         </w:rPr>
-        <w:t xml:space="preserve">Automatizar al menos </w:t>
+        <w:t xml:space="preserve">Automatizar </w:t>
       </w:r>
       <w:r>
         <w:rPr>
@@ -3706,7 +3810,7 @@
           <w:szCs w:val="22"/>
           <w:lang w:val="es-US"/>
         </w:rPr>
-        <w:t xml:space="preserve">la mitad </w:t>
+        <w:t>procesos administrativos clave</w:t>
       </w:r>
       <w:r>
         <w:rPr>
@@ -3717,7 +3821,62 @@
           <w:szCs w:val="22"/>
           <w:lang w:val="es-US"/>
         </w:rPr>
-        <w:t>de los procesos administrativos clave.</w:t>
+        <w:t xml:space="preserve"> como: generación de reportes, cierres de caja</w:t>
+      </w:r>
+      <w:r>
+        <w:rPr>
+          <w:rFonts w:ascii="Times New Roman" w:hAnsi="Times New Roman"/>
+          <w:i w:val="0"/>
+          <w:iCs/>
+          <w:sz w:val="24"/>
+          <w:szCs w:val="22"/>
+          <w:lang w:val="es-US"/>
+        </w:rPr>
+        <w:t>, generación de salarios y control de horario de los colaboradores</w:t>
+      </w:r>
+      <w:r>
+        <w:rPr>
+          <w:rFonts w:ascii="Times New Roman" w:hAnsi="Times New Roman"/>
+          <w:i w:val="0"/>
+          <w:iCs/>
+          <w:sz w:val="24"/>
+          <w:szCs w:val="22"/>
+          <w:lang w:val="es-US"/>
+        </w:rPr>
+        <w:t>,</w:t>
+      </w:r>
+      <w:r>
+        <w:rPr>
+          <w:rFonts w:ascii="Times New Roman" w:hAnsi="Times New Roman"/>
+          <w:i w:val="0"/>
+          <w:iCs/>
+          <w:sz w:val="24"/>
+          <w:szCs w:val="22"/>
+          <w:lang w:val="es-US"/>
+        </w:rPr>
+        <w:t xml:space="preserve"> y la generación del precio de los productos</w:t>
+      </w:r>
+      <w:r>
+        <w:rPr>
+          <w:rFonts w:ascii="Times New Roman" w:hAnsi="Times New Roman"/>
+          <w:i w:val="0"/>
+          <w:iCs/>
+          <w:sz w:val="24"/>
+          <w:szCs w:val="22"/>
+          <w:lang w:val="es-US"/>
+        </w:rPr>
+        <w:t xml:space="preserve"> traídos por proveedores en base al margen de utilidad y los impuestos</w:t>
+      </w:r>
+      <w:r>
+        <w:rPr>
+          <w:rFonts w:ascii="Times New Roman" w:hAnsi="Times New Roman"/>
+          <w:i w:val="0"/>
+          <w:iCs/>
+          <w:sz w:val="24"/>
+          <w:szCs w:val="22"/>
+          <w:lang w:val="es-US"/>
+        </w:rPr>
+        <w:t>.</w:t>
       </w:r>
       <w:r>
         <w:rPr>
@@ -3760,17 +3919,6 @@
         </w:rPr>
         <w:t>Reducir el tiempo promedio de generación de reportes financieros tras el primer mes de uso.</w:t>
       </w:r>
-      <w:r>
-        <w:rPr>
-          <w:rFonts w:ascii="Times New Roman" w:hAnsi="Times New Roman"/>
-          <w:i w:val="0"/>
-          <w:iCs/>
-          <w:sz w:val="24"/>
-          <w:szCs w:val="22"/>
-          <w:lang w:val="es-CR"/>
-        </w:rPr>
-        <w:t> </w:t>
-      </w:r>
     </w:p>
     <w:p>
       <w:pPr>
@@ -3876,18 +4024,29 @@
           <w:szCs w:val="22"/>
           <w:lang w:val="es-US"/>
         </w:rPr>
-        <w:t>Habilitar una gestión multiusuario con niveles de acceso diferenciados sin comprometer la seguridad de los datos.</w:t>
-      </w:r>
-      <w:r>
-        <w:rPr>
-          <w:rFonts w:ascii="Times New Roman" w:hAnsi="Times New Roman"/>
-          <w:i w:val="0"/>
-          <w:iCs/>
-          <w:sz w:val="24"/>
-          <w:szCs w:val="22"/>
-          <w:lang w:val="es-CR"/>
-        </w:rPr>
-        <w:t> </w:t>
+        <w:t>Habilitar una gestión multiusuario con niveles de acceso diferenciados</w:t>
+      </w:r>
+      <w:r>
+        <w:rPr>
+          <w:rFonts w:ascii="Times New Roman" w:hAnsi="Times New Roman"/>
+          <w:i w:val="0"/>
+          <w:iCs/>
+          <w:sz w:val="24"/>
+          <w:szCs w:val="22"/>
+          <w:lang w:val="es-US"/>
+        </w:rPr>
+        <w:t xml:space="preserve"> (roles)</w:t>
+      </w:r>
+      <w:r>
+        <w:rPr>
+          <w:rFonts w:ascii="Times New Roman" w:hAnsi="Times New Roman"/>
+          <w:i w:val="0"/>
+          <w:iCs/>
+          <w:sz w:val="24"/>
+          <w:szCs w:val="22"/>
+          <w:lang w:val="es-US"/>
+        </w:rPr>
+        <w:t xml:space="preserve"> sin comprometer la seguridad de los datos.</w:t>
       </w:r>
     </w:p>
     <w:p>
@@ -3935,7 +4094,40 @@
           <w:szCs w:val="22"/>
           <w:lang w:val="es-US"/>
         </w:rPr>
-        <w:t>Tasa de uso diario del sistema por parte de los empleados.</w:t>
+        <w:t>Adaptación al</w:t>
+      </w:r>
+      <w:r>
+        <w:rPr>
+          <w:rFonts w:ascii="Times New Roman" w:hAnsi="Times New Roman"/>
+          <w:i w:val="0"/>
+          <w:iCs/>
+          <w:sz w:val="24"/>
+          <w:szCs w:val="22"/>
+          <w:lang w:val="es-US"/>
+        </w:rPr>
+        <w:t xml:space="preserve"> sistema por parte de los</w:t>
+      </w:r>
+      <w:r>
+        <w:rPr>
+          <w:rFonts w:ascii="Times New Roman" w:hAnsi="Times New Roman"/>
+          <w:i w:val="0"/>
+          <w:iCs/>
+          <w:sz w:val="24"/>
+          <w:szCs w:val="22"/>
+          <w:lang w:val="es-US"/>
+        </w:rPr>
+        <w:t xml:space="preserve"> colaboradores</w:t>
+      </w:r>
+      <w:r>
+        <w:rPr>
+          <w:rFonts w:ascii="Times New Roman" w:hAnsi="Times New Roman"/>
+          <w:i w:val="0"/>
+          <w:iCs/>
+          <w:sz w:val="24"/>
+          <w:szCs w:val="22"/>
+          <w:lang w:val="es-US"/>
+        </w:rPr>
+        <w:t>.</w:t>
       </w:r>
       <w:r>
         <w:rPr>
@@ -3976,38 +4168,8 @@
           <w:szCs w:val="22"/>
           <w:lang w:val="es-US"/>
         </w:rPr>
-        <w:t>Número de errores reportados por mes relacionados con registro de datos.</w:t>
-      </w:r>
-      <w:r>
-        <w:rPr>
-          <w:rFonts w:ascii="Times New Roman" w:hAnsi="Times New Roman"/>
-          <w:i w:val="0"/>
-          <w:iCs/>
-          <w:sz w:val="24"/>
-          <w:szCs w:val="22"/>
-          <w:lang w:val="es-CR"/>
-        </w:rPr>
-        <w:t> </w:t>
-      </w:r>
-    </w:p>
-    <w:p>
-      <w:pPr>
-        <w:pStyle w:val="Textoindependiente"/>
-        <w:numPr>
-          <w:ilvl w:val="0"/>
-          <w:numId w:val="10"/>
-        </w:numPr>
-        <w:spacing w:line="360" w:lineRule="auto"/>
-        <w:jc w:val="both"/>
-        <w:rPr>
-          <w:rFonts w:ascii="Times New Roman" w:hAnsi="Times New Roman"/>
-          <w:i w:val="0"/>
-          <w:iCs/>
-          <w:sz w:val="24"/>
-          <w:szCs w:val="22"/>
-          <w:lang w:val="es-CR"/>
-        </w:rPr>
-      </w:pPr>
+        <w:t xml:space="preserve">Número de errores reportados </w:t>
+      </w:r>
       <w:r>
         <w:rPr>
           <w:rFonts w:ascii="Times New Roman" w:hAnsi="Times New Roman"/>
@@ -4017,38 +4179,8 @@
           <w:szCs w:val="22"/>
           <w:lang w:val="es-US"/>
         </w:rPr>
-        <w:t>Tiempo de respuesta al generar reportes o consultar datos administrativos. </w:t>
-      </w:r>
-      <w:r>
-        <w:rPr>
-          <w:rFonts w:ascii="Times New Roman" w:hAnsi="Times New Roman"/>
-          <w:i w:val="0"/>
-          <w:iCs/>
-          <w:sz w:val="24"/>
-          <w:szCs w:val="22"/>
-          <w:lang w:val="es-CR"/>
-        </w:rPr>
-        <w:t> </w:t>
-      </w:r>
-    </w:p>
-    <w:p>
-      <w:pPr>
-        <w:pStyle w:val="Textoindependiente"/>
-        <w:numPr>
-          <w:ilvl w:val="0"/>
-          <w:numId w:val="11"/>
-        </w:numPr>
-        <w:spacing w:line="360" w:lineRule="auto"/>
-        <w:jc w:val="both"/>
-        <w:rPr>
-          <w:rFonts w:ascii="Times New Roman" w:hAnsi="Times New Roman"/>
-          <w:i w:val="0"/>
-          <w:iCs/>
-          <w:sz w:val="24"/>
-          <w:szCs w:val="22"/>
-          <w:lang w:val="es-CR"/>
-        </w:rPr>
-      </w:pPr>
+        <w:t>al</w:t>
+      </w:r>
       <w:r>
         <w:rPr>
           <w:rFonts w:ascii="Times New Roman" w:hAnsi="Times New Roman"/>
@@ -4058,38 +4190,8 @@
           <w:szCs w:val="22"/>
           <w:lang w:val="es-US"/>
         </w:rPr>
-        <w:t>Nivel de satisfacción de usuarios internos. </w:t>
-      </w:r>
-      <w:r>
-        <w:rPr>
-          <w:rFonts w:ascii="Times New Roman" w:hAnsi="Times New Roman"/>
-          <w:i w:val="0"/>
-          <w:iCs/>
-          <w:sz w:val="24"/>
-          <w:szCs w:val="22"/>
-          <w:lang w:val="es-CR"/>
-        </w:rPr>
-        <w:t> </w:t>
-      </w:r>
-    </w:p>
-    <w:p>
-      <w:pPr>
-        <w:pStyle w:val="Textoindependiente"/>
-        <w:numPr>
-          <w:ilvl w:val="0"/>
-          <w:numId w:val="12"/>
-        </w:numPr>
-        <w:spacing w:line="360" w:lineRule="auto"/>
-        <w:jc w:val="both"/>
-        <w:rPr>
-          <w:rFonts w:ascii="Times New Roman" w:hAnsi="Times New Roman"/>
-          <w:i w:val="0"/>
-          <w:iCs/>
-          <w:sz w:val="24"/>
-          <w:szCs w:val="22"/>
-          <w:lang w:val="es-CR"/>
-        </w:rPr>
-      </w:pPr>
+        <w:t xml:space="preserve"> mes </w:t>
+      </w:r>
       <w:r>
         <w:rPr>
           <w:rFonts w:ascii="Times New Roman" w:hAnsi="Times New Roman"/>
@@ -4099,18 +4201,18 @@
           <w:szCs w:val="22"/>
           <w:lang w:val="es-US"/>
         </w:rPr>
-        <w:t>Tiempo de capacitación promedio requerido para nuevos usuarios.</w:t>
-      </w:r>
-      <w:r>
-        <w:rPr>
-          <w:rFonts w:ascii="Times New Roman" w:hAnsi="Times New Roman"/>
-          <w:i w:val="0"/>
-          <w:iCs/>
-          <w:sz w:val="24"/>
-          <w:szCs w:val="22"/>
-          <w:lang w:val="es-CR"/>
-        </w:rPr>
-        <w:t> </w:t>
+        <w:t>por parte de los colaboradores</w:t>
+      </w:r>
+      <w:r>
+        <w:rPr>
+          <w:rFonts w:ascii="Times New Roman" w:hAnsi="Times New Roman"/>
+          <w:i w:val="0"/>
+          <w:iCs/>
+          <w:sz w:val="24"/>
+          <w:szCs w:val="22"/>
+          <w:lang w:val="es-US"/>
+        </w:rPr>
+        <w:t>.</w:t>
       </w:r>
     </w:p>
     <w:p>
@@ -4167,7 +4269,6 @@
         <w:rPr>
           <w:lang w:val="es-CR"/>
         </w:rPr>
-        <w:lastRenderedPageBreak/>
         <w:t>Declaración de Visión</w:t>
       </w:r>
       <w:bookmarkEnd w:id="18"/>
@@ -4197,7 +4298,19 @@
           <w:szCs w:val="22"/>
           <w:lang w:val="es-CR"/>
         </w:rPr>
-        <w:t>El sistema de gestión interna para el restaurante El Bambú será una herramienta digital robusta, intuitiva y adaptada a las necesidades reales del negocio. Permitirá automatizar procesos operativos y administrativos, incrementar la eficiencia general del restaurante y respaldar la toma de decisiones mediante información precisa y en tiempo real. La solución estará diseñada para facilitar las labores diarias del personal y brindar un servicio más ágil, organizado y profesional a los clientes.</w:t>
+        <w:t xml:space="preserve">El sistema de gestión interna para el restaurante El Bambú será una herramienta digital robusta, intuitiva y adaptada a las necesidades reales del negocio. Permitirá automatizar procesos operativos y administrativos, incrementar la eficiencia general del restaurante y respaldar la toma de decisiones mediante información precisa y en tiempo real. La solución estará diseñada para </w:t>
+      </w:r>
+      <w:r>
+        <w:rPr>
+          <w:rFonts w:ascii="Times New Roman" w:hAnsi="Times New Roman"/>
+          <w:i w:val="0"/>
+          <w:iCs/>
+          <w:sz w:val="24"/>
+          <w:szCs w:val="22"/>
+          <w:lang w:val="es-CR"/>
+        </w:rPr>
+        <w:lastRenderedPageBreak/>
+        <w:t>facilitar las labores diarias del personal y brindar un servicio más ágil, organizado y profesional a los clientes.</w:t>
       </w:r>
     </w:p>
     <w:p>
@@ -4251,7 +4364,6 @@
               <w:bottom w:val="single" w:sz="6" w:space="0" w:color="auto"/>
               <w:right w:val="single" w:sz="6" w:space="0" w:color="auto"/>
             </w:tcBorders>
-            <w:shd w:val="clear" w:color="auto" w:fill="auto"/>
             <w:hideMark/>
           </w:tcPr>
           <w:p>
@@ -4302,7 +4414,6 @@
               <w:bottom w:val="single" w:sz="6" w:space="0" w:color="auto"/>
               <w:right w:val="single" w:sz="6" w:space="0" w:color="auto"/>
             </w:tcBorders>
-            <w:shd w:val="clear" w:color="auto" w:fill="auto"/>
             <w:hideMark/>
           </w:tcPr>
           <w:p>
@@ -4353,7 +4464,6 @@
               <w:bottom w:val="single" w:sz="6" w:space="0" w:color="auto"/>
               <w:right w:val="single" w:sz="6" w:space="0" w:color="auto"/>
             </w:tcBorders>
-            <w:shd w:val="clear" w:color="auto" w:fill="auto"/>
             <w:hideMark/>
           </w:tcPr>
           <w:p>
@@ -4409,7 +4519,6 @@
               <w:bottom w:val="single" w:sz="6" w:space="0" w:color="auto"/>
               <w:right w:val="single" w:sz="6" w:space="0" w:color="auto"/>
             </w:tcBorders>
-            <w:shd w:val="clear" w:color="auto" w:fill="auto"/>
             <w:hideMark/>
           </w:tcPr>
           <w:p>
@@ -4459,7 +4568,6 @@
               <w:bottom w:val="single" w:sz="6" w:space="0" w:color="auto"/>
               <w:right w:val="single" w:sz="6" w:space="0" w:color="auto"/>
             </w:tcBorders>
-            <w:shd w:val="clear" w:color="auto" w:fill="auto"/>
             <w:hideMark/>
           </w:tcPr>
           <w:p>
@@ -4498,7 +4606,6 @@
               <w:bottom w:val="single" w:sz="6" w:space="0" w:color="auto"/>
               <w:right w:val="single" w:sz="6" w:space="0" w:color="auto"/>
             </w:tcBorders>
-            <w:shd w:val="clear" w:color="auto" w:fill="auto"/>
             <w:hideMark/>
           </w:tcPr>
           <w:p>
@@ -4553,7 +4660,6 @@
               <w:bottom w:val="single" w:sz="6" w:space="0" w:color="auto"/>
               <w:right w:val="single" w:sz="6" w:space="0" w:color="auto"/>
             </w:tcBorders>
-            <w:shd w:val="clear" w:color="auto" w:fill="auto"/>
             <w:hideMark/>
           </w:tcPr>
           <w:p>
@@ -4603,7 +4709,6 @@
               <w:bottom w:val="single" w:sz="6" w:space="0" w:color="auto"/>
               <w:right w:val="single" w:sz="6" w:space="0" w:color="auto"/>
             </w:tcBorders>
-            <w:shd w:val="clear" w:color="auto" w:fill="auto"/>
             <w:hideMark/>
           </w:tcPr>
           <w:p>
@@ -4642,7 +4747,6 @@
               <w:bottom w:val="single" w:sz="6" w:space="0" w:color="auto"/>
               <w:right w:val="single" w:sz="6" w:space="0" w:color="auto"/>
             </w:tcBorders>
-            <w:shd w:val="clear" w:color="auto" w:fill="auto"/>
             <w:hideMark/>
           </w:tcPr>
           <w:p>
@@ -4697,7 +4801,6 @@
               <w:bottom w:val="single" w:sz="6" w:space="0" w:color="auto"/>
               <w:right w:val="single" w:sz="6" w:space="0" w:color="auto"/>
             </w:tcBorders>
-            <w:shd w:val="clear" w:color="auto" w:fill="auto"/>
             <w:hideMark/>
           </w:tcPr>
           <w:p>
@@ -4747,7 +4850,6 @@
               <w:bottom w:val="single" w:sz="6" w:space="0" w:color="auto"/>
               <w:right w:val="single" w:sz="6" w:space="0" w:color="auto"/>
             </w:tcBorders>
-            <w:shd w:val="clear" w:color="auto" w:fill="auto"/>
             <w:hideMark/>
           </w:tcPr>
           <w:p>
@@ -4786,7 +4888,6 @@
               <w:bottom w:val="single" w:sz="6" w:space="0" w:color="auto"/>
               <w:right w:val="single" w:sz="6" w:space="0" w:color="auto"/>
             </w:tcBorders>
-            <w:shd w:val="clear" w:color="auto" w:fill="auto"/>
             <w:hideMark/>
           </w:tcPr>
           <w:p>
@@ -4967,7 +5068,6 @@
           <w:szCs w:val="22"/>
           <w:lang w:val="es-CR"/>
         </w:rPr>
-        <w:lastRenderedPageBreak/>
         <w:t>Gestionar reservaciones de eventos privados y servicios especiales (Módulo de Reservaciones). </w:t>
       </w:r>
     </w:p>
@@ -5033,6 +5133,7 @@
           <w:szCs w:val="22"/>
           <w:lang w:val="es-CR"/>
         </w:rPr>
+        <w:lastRenderedPageBreak/>
         <w:t>Con este alcance, se busca mejorar la precisión del control financiero, optimizar la oferta gastronómica y aumentar la eficiencia administrativa en general. </w:t>
       </w:r>
     </w:p>
@@ -5691,7 +5792,6 @@
           <w:szCs w:val="22"/>
           <w:lang w:val="es-CR"/>
         </w:rPr>
-        <w:lastRenderedPageBreak/>
         <w:t>Registro detallado de ventas con desglose de productos y precios. </w:t>
       </w:r>
     </w:p>
@@ -5851,6 +5951,7 @@
           <w:szCs w:val="22"/>
           <w:lang w:val="es-CR"/>
         </w:rPr>
+        <w:lastRenderedPageBreak/>
         <w:t>Cálculo de salarios con base en horas trabajadas. </w:t>
       </w:r>
     </w:p>
@@ -6373,7 +6474,29 @@
           <w:szCs w:val="22"/>
           <w:lang w:val="es-CR"/>
         </w:rPr>
-        <w:t>Gestión dinámica de platillos, bebidas y productos, con control de disponibilidad, precios e inventario de ingredientes.</w:t>
+        <w:t>Gestión dinámica de platillos, bebidas y productos, con control de disponibilidad, precios e inventario de</w:t>
+      </w:r>
+      <w:r>
+        <w:rPr>
+          <w:rFonts w:ascii="Times New Roman" w:hAnsi="Times New Roman"/>
+          <w:i w:val="0"/>
+          <w:iCs/>
+          <w:sz w:val="24"/>
+          <w:szCs w:val="22"/>
+          <w:lang w:val="es-CR"/>
+        </w:rPr>
+        <w:t xml:space="preserve"> productos</w:t>
+      </w:r>
+      <w:r>
+        <w:rPr>
+          <w:rFonts w:ascii="Times New Roman" w:hAnsi="Times New Roman"/>
+          <w:i w:val="0"/>
+          <w:iCs/>
+          <w:sz w:val="24"/>
+          <w:szCs w:val="22"/>
+          <w:lang w:val="es-CR"/>
+        </w:rPr>
+        <w:t>.</w:t>
       </w:r>
     </w:p>
     <w:p>
@@ -6427,7 +6550,40 @@
           <w:szCs w:val="22"/>
           <w:lang w:val="es-CR"/>
         </w:rPr>
-        <w:t>Organización de eventos privados mediante un sistema de reservas con control de capacidad y disponibilidad en tiempo real.</w:t>
+        <w:t>Organización de eventos privados mediante un sistema de reservas con control de capacidad</w:t>
+      </w:r>
+      <w:r>
+        <w:rPr>
+          <w:rFonts w:ascii="Times New Roman" w:hAnsi="Times New Roman"/>
+          <w:i w:val="0"/>
+          <w:iCs/>
+          <w:sz w:val="24"/>
+          <w:szCs w:val="22"/>
+          <w:lang w:val="es-CR"/>
+        </w:rPr>
+        <w:t xml:space="preserve">, así como la gestión de convenios con otros establecimientos y/o </w:t>
+      </w:r>
+      <w:r>
+        <w:rPr>
+          <w:rFonts w:ascii="Times New Roman" w:hAnsi="Times New Roman"/>
+          <w:i w:val="0"/>
+          <w:iCs/>
+          <w:sz w:val="24"/>
+          <w:szCs w:val="22"/>
+          <w:lang w:val="es-CR"/>
+        </w:rPr>
+        <w:t>clientes</w:t>
+      </w:r>
+      <w:r>
+        <w:rPr>
+          <w:rFonts w:ascii="Times New Roman" w:hAnsi="Times New Roman"/>
+          <w:i w:val="0"/>
+          <w:iCs/>
+          <w:sz w:val="24"/>
+          <w:szCs w:val="22"/>
+          <w:lang w:val="es-CR"/>
+        </w:rPr>
+        <w:t>.</w:t>
       </w:r>
     </w:p>
     <w:p>
@@ -6506,7 +6662,7 @@
           <w:szCs w:val="22"/>
           <w:lang w:val="es-CR"/>
         </w:rPr>
-        <w:t>Registro detallado de ventas, generación de recibos físicos o digitales, y mantenimiento de historiales de consumo.</w:t>
+        <w:t>Registro detallado de ventas, generación de recibos físicos, y mantenimiento de historiales de consumo.</w:t>
       </w:r>
     </w:p>
     <w:p>
@@ -6641,7 +6797,6 @@
           <w:szCs w:val="22"/>
           <w:lang w:val="es-CR"/>
         </w:rPr>
-        <w:lastRenderedPageBreak/>
         <w:t>El sistema está diseñado para proporcionar:</w:t>
       </w:r>
     </w:p>
@@ -6762,6 +6917,7 @@
           <w:szCs w:val="22"/>
           <w:lang w:val="es-CR"/>
         </w:rPr>
+        <w:lastRenderedPageBreak/>
         <w:t>Interfaz intuitiva, accesible para usuarios sin experiencia técnica.</w:t>
       </w:r>
     </w:p>
@@ -7081,7 +7237,29 @@
           <w:szCs w:val="22"/>
           <w:lang w:val="es-CR"/>
         </w:rPr>
-        <w:t>No se incluirán módulos de predicciones, dashboards dinámicos o analítica avanzada.</w:t>
+        <w:t>No se incluirán módulos de predicciones</w:t>
+      </w:r>
+      <w:r>
+        <w:rPr>
+          <w:rFonts w:ascii="Times New Roman" w:hAnsi="Times New Roman"/>
+          <w:i w:val="0"/>
+          <w:iCs/>
+          <w:sz w:val="24"/>
+          <w:szCs w:val="22"/>
+          <w:lang w:val="es-CR"/>
+        </w:rPr>
+        <w:t xml:space="preserve"> o </w:t>
+      </w:r>
+      <w:r>
+        <w:rPr>
+          <w:rFonts w:ascii="Times New Roman" w:hAnsi="Times New Roman"/>
+          <w:i w:val="0"/>
+          <w:iCs/>
+          <w:sz w:val="24"/>
+          <w:szCs w:val="22"/>
+          <w:lang w:val="es-CR"/>
+        </w:rPr>
+        <w:t>analítica avanzada.</w:t>
       </w:r>
     </w:p>
     <w:p>
@@ -7215,15 +7393,7 @@
           <w:szCs w:val="22"/>
           <w:lang w:val="es-CR"/>
         </w:rPr>
-        <w:t xml:space="preserve">Soda y Restaurante El Bambú, donde la gestión manual de información ha limitado la eficiencia operativa y dificultado la toma de decisiones basada en datos. El sistema propuesto busca automatizar procesos clave, optimizar recursos y proporcionar herramientas que mejoren el control </w:t>
-      </w:r>
-      <w:r>
-        <w:rPr>
-          <w:szCs w:val="22"/>
-          <w:lang w:val="es-CR"/>
-        </w:rPr>
-        <w:lastRenderedPageBreak/>
-        <w:t>administrativo, financiero y operativo. En este apartado se identifican los perfiles de las partes interesadas en el proyecto, así como las consideraciones necesarias para su adecuada implementación en el entorno del restaurante.</w:t>
+        <w:t>Soda y Restaurante El Bambú, donde la gestión manual de información ha limitado la eficiencia operativa y dificultado la toma de decisiones basada en datos. El sistema propuesto busca automatizar procesos clave, optimizar recursos y proporcionar herramientas que mejoren el control administrativo, financiero y operativo. En este apartado se identifican los perfiles de las partes interesadas en el proyecto, así como las consideraciones necesarias para su adecuada implementación en el entorno del restaurante.</w:t>
       </w:r>
     </w:p>
     <w:p>
@@ -7238,13 +7408,28 @@
         <w:rPr>
           <w:lang w:val="es-CR"/>
         </w:rPr>
+        <w:lastRenderedPageBreak/>
         <w:t>Perfiles de los grupos de interés</w:t>
       </w:r>
       <w:r>
         <w:rPr>
           <w:lang w:val="es-CR"/>
         </w:rPr>
-        <w:t xml:space="preserve"> (Stakeholders)</w:t>
+        <w:t xml:space="preserve"> (</w:t>
+      </w:r>
+      <w:proofErr w:type="spellStart"/>
+      <w:r>
+        <w:rPr>
+          <w:lang w:val="es-CR"/>
+        </w:rPr>
+        <w:t>Stakeholders</w:t>
+      </w:r>
+      <w:proofErr w:type="spellEnd"/>
+      <w:r>
+        <w:rPr>
+          <w:lang w:val="es-CR"/>
+        </w:rPr>
+        <w:t>)</w:t>
       </w:r>
       <w:bookmarkEnd w:id="33"/>
       <w:bookmarkEnd w:id="34"/>
@@ -7292,6 +7477,7 @@
                 <w:lang w:val="es-CR"/>
               </w:rPr>
             </w:pPr>
+            <w:proofErr w:type="spellStart"/>
             <w:r>
               <w:rPr>
                 <w:b/>
@@ -7300,6 +7486,7 @@
               </w:rPr>
               <w:t>Stakeholder</w:t>
             </w:r>
+            <w:proofErr w:type="spellEnd"/>
             <w:r>
               <w:rPr>
                 <w:lang w:val="es-CR"/>
@@ -7392,7 +7579,6 @@
               <w:bottom w:val="single" w:sz="6" w:space="0" w:color="auto"/>
               <w:right w:val="single" w:sz="6" w:space="0" w:color="auto"/>
             </w:tcBorders>
-            <w:shd w:val="clear" w:color="auto" w:fill="auto"/>
             <w:hideMark/>
           </w:tcPr>
           <w:p>
@@ -7420,7 +7606,6 @@
               <w:bottom w:val="single" w:sz="6" w:space="0" w:color="auto"/>
               <w:right w:val="single" w:sz="6" w:space="0" w:color="auto"/>
             </w:tcBorders>
-            <w:shd w:val="clear" w:color="auto" w:fill="auto"/>
             <w:hideMark/>
           </w:tcPr>
           <w:p>
@@ -7448,7 +7633,6 @@
               <w:bottom w:val="single" w:sz="6" w:space="0" w:color="auto"/>
               <w:right w:val="single" w:sz="12" w:space="0" w:color="auto"/>
             </w:tcBorders>
-            <w:shd w:val="clear" w:color="auto" w:fill="auto"/>
             <w:hideMark/>
           </w:tcPr>
           <w:p>
@@ -7481,7 +7665,6 @@
               <w:bottom w:val="single" w:sz="6" w:space="0" w:color="auto"/>
               <w:right w:val="single" w:sz="6" w:space="0" w:color="auto"/>
             </w:tcBorders>
-            <w:shd w:val="clear" w:color="auto" w:fill="auto"/>
             <w:hideMark/>
           </w:tcPr>
           <w:p>
@@ -7509,7 +7692,6 @@
               <w:bottom w:val="single" w:sz="6" w:space="0" w:color="auto"/>
               <w:right w:val="single" w:sz="6" w:space="0" w:color="auto"/>
             </w:tcBorders>
-            <w:shd w:val="clear" w:color="auto" w:fill="auto"/>
             <w:hideMark/>
           </w:tcPr>
           <w:p>
@@ -7537,7 +7719,6 @@
               <w:bottom w:val="single" w:sz="6" w:space="0" w:color="auto"/>
               <w:right w:val="single" w:sz="12" w:space="0" w:color="auto"/>
             </w:tcBorders>
-            <w:shd w:val="clear" w:color="auto" w:fill="auto"/>
             <w:hideMark/>
           </w:tcPr>
           <w:p>
@@ -7570,7 +7751,6 @@
               <w:bottom w:val="single" w:sz="6" w:space="0" w:color="auto"/>
               <w:right w:val="single" w:sz="6" w:space="0" w:color="auto"/>
             </w:tcBorders>
-            <w:shd w:val="clear" w:color="auto" w:fill="auto"/>
             <w:hideMark/>
           </w:tcPr>
           <w:p>
@@ -7598,7 +7778,6 @@
               <w:bottom w:val="single" w:sz="6" w:space="0" w:color="auto"/>
               <w:right w:val="single" w:sz="6" w:space="0" w:color="auto"/>
             </w:tcBorders>
-            <w:shd w:val="clear" w:color="auto" w:fill="auto"/>
             <w:hideMark/>
           </w:tcPr>
           <w:p>
@@ -7626,7 +7805,6 @@
               <w:bottom w:val="single" w:sz="6" w:space="0" w:color="auto"/>
               <w:right w:val="single" w:sz="12" w:space="0" w:color="auto"/>
             </w:tcBorders>
-            <w:shd w:val="clear" w:color="auto" w:fill="auto"/>
             <w:hideMark/>
           </w:tcPr>
           <w:p>
@@ -7659,7 +7837,6 @@
               <w:bottom w:val="single" w:sz="12" w:space="0" w:color="auto"/>
               <w:right w:val="single" w:sz="6" w:space="0" w:color="auto"/>
             </w:tcBorders>
-            <w:shd w:val="clear" w:color="auto" w:fill="auto"/>
             <w:hideMark/>
           </w:tcPr>
           <w:p>
@@ -7687,7 +7864,6 @@
               <w:bottom w:val="single" w:sz="12" w:space="0" w:color="auto"/>
               <w:right w:val="single" w:sz="6" w:space="0" w:color="auto"/>
             </w:tcBorders>
-            <w:shd w:val="clear" w:color="auto" w:fill="auto"/>
             <w:hideMark/>
           </w:tcPr>
           <w:p>
@@ -7715,7 +7891,6 @@
               <w:bottom w:val="single" w:sz="12" w:space="0" w:color="auto"/>
               <w:right w:val="single" w:sz="12" w:space="0" w:color="auto"/>
             </w:tcBorders>
-            <w:shd w:val="clear" w:color="auto" w:fill="auto"/>
             <w:hideMark/>
           </w:tcPr>
           <w:p>
@@ -7966,7 +8141,6 @@
           <w:szCs w:val="22"/>
           <w:lang w:val="es-CR"/>
         </w:rPr>
-        <w:lastRenderedPageBreak/>
         <w:t>Infraestructura:</w:t>
       </w:r>
       <w:r>
@@ -8161,6 +8335,7 @@
           <w:szCs w:val="22"/>
           <w:lang w:val="es-CR"/>
         </w:rPr>
+        <w:lastRenderedPageBreak/>
         <w:t>Equipos complementarios como impresoras para la emisión de facturas o recibos físicos</w:t>
       </w:r>
       <w:r>
@@ -9027,10 +9202,68 @@
       <w:rPr>
         <w:lang w:val="es-CR"/>
       </w:rPr>
-      <w:t xml:space="preserve">Derechos de autor © 2023 por Karl Wiegers y Seilevel Partners LP. </w:t>
+      <w:t xml:space="preserve">Derechos de autor © 2023 por Karl </w:t>
+    </w:r>
+    <w:proofErr w:type="spellStart"/>
+    <w:r>
+      <w:rPr>
+        <w:lang w:val="es-CR"/>
+      </w:rPr>
+      <w:t>Wiegers</w:t>
+    </w:r>
+    <w:proofErr w:type="spellEnd"/>
+    <w:r>
+      <w:rPr>
+        <w:lang w:val="es-CR"/>
+      </w:rPr>
+      <w:t xml:space="preserve"> y </w:t>
+    </w:r>
+    <w:proofErr w:type="spellStart"/>
+    <w:r>
+      <w:rPr>
+        <w:lang w:val="es-CR"/>
+      </w:rPr>
+      <w:t>Seilevel</w:t>
+    </w:r>
+    <w:proofErr w:type="spellEnd"/>
+    <w:r>
+      <w:rPr>
+        <w:lang w:val="es-CR"/>
+      </w:rPr>
+      <w:t xml:space="preserve"> </w:t>
+    </w:r>
+    <w:proofErr w:type="spellStart"/>
+    <w:r>
+      <w:rPr>
+        <w:lang w:val="es-CR"/>
+      </w:rPr>
+      <w:t>Partners</w:t>
+    </w:r>
+    <w:proofErr w:type="spellEnd"/>
+    <w:r>
+      <w:rPr>
+        <w:lang w:val="es-CR"/>
+      </w:rPr>
+      <w:t xml:space="preserve"> LP. </w:t>
     </w:r>
     <w:r>
-      <w:t>Se concede permiso para usar y modificar.</w:t>
+      <w:t xml:space="preserve">Se concede </w:t>
+    </w:r>
+    <w:proofErr w:type="spellStart"/>
+    <w:r>
+      <w:t>permiso</w:t>
+    </w:r>
+    <w:proofErr w:type="spellEnd"/>
+    <w:r>
+      <w:t xml:space="preserve"> para usar y </w:t>
+    </w:r>
+    <w:proofErr w:type="spellStart"/>
+    <w:r>
+      <w:t>modificar</w:t>
+    </w:r>
+    <w:proofErr w:type="spellEnd"/>
+    <w:r>
+      <w:t>.</w:t>
     </w:r>
   </w:p>
 </w:ftr>
@@ -9051,10 +9284,68 @@
       <w:rPr>
         <w:lang w:val="es-CR"/>
       </w:rPr>
-      <w:t xml:space="preserve">Derechos de autor © 2023 por Karl Wiegers y Seilevel Partners LP. </w:t>
+      <w:t xml:space="preserve">Derechos de autor © 2023 por Karl </w:t>
+    </w:r>
+    <w:proofErr w:type="spellStart"/>
+    <w:r>
+      <w:rPr>
+        <w:lang w:val="es-CR"/>
+      </w:rPr>
+      <w:t>Wiegers</w:t>
+    </w:r>
+    <w:proofErr w:type="spellEnd"/>
+    <w:r>
+      <w:rPr>
+        <w:lang w:val="es-CR"/>
+      </w:rPr>
+      <w:t xml:space="preserve"> y </w:t>
+    </w:r>
+    <w:proofErr w:type="spellStart"/>
+    <w:r>
+      <w:rPr>
+        <w:lang w:val="es-CR"/>
+      </w:rPr>
+      <w:t>Seilevel</w:t>
+    </w:r>
+    <w:proofErr w:type="spellEnd"/>
+    <w:r>
+      <w:rPr>
+        <w:lang w:val="es-CR"/>
+      </w:rPr>
+      <w:t xml:space="preserve"> </w:t>
+    </w:r>
+    <w:proofErr w:type="spellStart"/>
+    <w:r>
+      <w:rPr>
+        <w:lang w:val="es-CR"/>
+      </w:rPr>
+      <w:t>Partners</w:t>
+    </w:r>
+    <w:proofErr w:type="spellEnd"/>
+    <w:r>
+      <w:rPr>
+        <w:lang w:val="es-CR"/>
+      </w:rPr>
+      <w:t xml:space="preserve"> LP. </w:t>
     </w:r>
     <w:r>
-      <w:t>Se concede permiso para usar y modificar.</w:t>
+      <w:t xml:space="preserve">Se concede </w:t>
+    </w:r>
+    <w:proofErr w:type="spellStart"/>
+    <w:r>
+      <w:t>permiso</w:t>
+    </w:r>
+    <w:proofErr w:type="spellEnd"/>
+    <w:r>
+      <w:t xml:space="preserve"> para usar y </w:t>
+    </w:r>
+    <w:proofErr w:type="spellStart"/>
+    <w:r>
+      <w:t>modificar</w:t>
+    </w:r>
+    <w:proofErr w:type="spellEnd"/>
+    <w:r>
+      <w:t>.</w:t>
     </w:r>
   </w:p>
 </w:ftr>

</xml_diff>